<commit_message>
Cameroun : version finale du programme 2027-2029 et discours à la Nation, après vérifications finales
- Programme final en 8 chantiers, 100 jours et cadre financier reproductible (3 scénarios)
- Vérifications finances-énergie-dette et juridique-commerce-institutions intégrées
- Discours à la Nation (≈5 100 mots, 35-45 minutes)
- Corrections : électricité (pertes ≈30 %, tarif ≈80 % du coût), arriérés 703,5 Mds (estimation provisoire),
  autorité de nomination des DG à trancher, production de riz (sources incompatibles), droits de douane

Co-Authored-By: Claude Opus 5.5 <noreply@anthropic.com>
Claude-Session: https://claude.ai/code/session_012Wp1za2jYQfXg3djKdum4N
</commit_message>
<xml_diff>
--- a/cameroun/outputs/analyse_critique_plan_2026-10-20.docx
+++ b/cameroun/outputs/analyse_critique_plan_2026-10-20.docx
@@ -198,7 +198,7 @@
         <w:spacing w:after="60"/>
       </w:pPr>
       <w:r>
-        <w:t xml:space="preserve">Les 703,5 Mds FCFA de restes à payer n'ont pas de source retrouvée.</w:t>
+        <w:t xml:space="preserve">Les 703,5 Mds FCFA d'arriérés sont une estimation provisoire de fin avril 2026, reprise à fin juin (vérification du 20/10).</w:t>
       </w:r>
     </w:p>
     <w:p>
@@ -1955,7 +1955,7 @@
                 <w:sz w:val="16"/>
                 <w:szCs w:val="16"/>
               </w:rPr>
-              <w:t xml:space="preserve">Non sourcé</w:t>
+              <w:t xml:space="preserve">Partiel (vérification finale)</w:t>
             </w:r>
           </w:p>
         </w:tc>
@@ -1975,7 +1975,7 @@
                 <w:sz w:val="16"/>
                 <w:szCs w:val="16"/>
               </w:rPr>
-              <w:t xml:space="preserve">Aucune source retrouvée. Derniers chiffres : 1 026,3 Mds fin 2025, dont 44,1 % à plus de 3 mois, selon la CAA via la presse. Obtenir la note CAA n° 06/2026 [VPL-12]</w:t>
+              <w:t xml:space="preserve">Estimation provisoire de fin avril 2026, reprise dans la note CAA de fin juin selon la presse. Le stock total de restes à payer était de 1 026,3 Mds fin mars 2026, dont 452,5 Mds de plus de 3 mois [VFF-001, VFF-004]</w:t>
             </w:r>
           </w:p>
         </w:tc>
@@ -2718,7 +2718,7 @@
         <w:t xml:space="preserve">Électricité.</w:t>
       </w:r>
       <w:r>
-        <w:t xml:space="preserve"> Le Plan traite ENEO comme une entreprise publique parmi d'autres. Il n'y a pas de fiche sur les pertes (≈27 % en distribution [ECO-05]), le recouvrement, l'écart tarif-coût (18,2 %), le contrat Nachtigal (paiement garanti même si l'énergie n'est pas utilisée), la ligne Nachtigal–Douala ou la protection des petits consommateurs.</w:t>
+        <w:t xml:space="preserve"> Le Plan traite ENEO comme une entreprise publique parmi d'autres. Il n'y a pas de fiche sur les pertes (≈30 % [VFF-015]), le recouvrement (72 à 77,5 %), l'écart tarif-coût (le tarif couvre ≈80 % du coût), le contrat Nachtigal (paiement garanti même si l'énergie n'est pas utilisée), la ligne Nachtigal–Douala ou la protection des petits consommateurs.</w:t>
       </w:r>
     </w:p>
     <w:p>
@@ -2798,10 +2798,20 @@
           <w:b/>
           <w:bCs/>
         </w:rPr>
+        <w:t xml:space="preserve">établissements publics</w:t>
+      </w:r>
+      <w:r>
+        <w:t xml:space="preserve"> sont nommés par décret (loi 2017/010, art. 35). Pour les </w:t>
+      </w:r>
+      <w:r>
+        <w:rPr>
+          <w:b/>
+          <w:bCs/>
+        </w:rPr>
         <w:t xml:space="preserve">entreprises publiques</w:t>
       </w:r>
       <w:r>
-        <w:t xml:space="preserve"> sont nommés par le </w:t>
+        <w:t xml:space="preserve">, la loi confie la nomination au </w:t>
       </w:r>
       <w:r>
         <w:rPr>
@@ -2811,17 +2821,7 @@
         <w:t xml:space="preserve">conseil d'administration</w:t>
       </w:r>
       <w:r>
-        <w:t xml:space="preserve"> (loi 2017/011, art. 70) ; ceux des </w:t>
-      </w:r>
-      <w:r>
-        <w:rPr>
-          <w:b/>
-          <w:bCs/>
-        </w:rPr>
-        <w:t xml:space="preserve">établissements publics</w:t>
-      </w:r>
-      <w:r>
-        <w:t xml:space="preserve"> par décret (loi 2017/010, art. 35) ;</w:t>
+        <w:t xml:space="preserve"> (loi 2017/011, art. 70), mais la pratique du décret existe (CAMTEL, par exemple) : point à trancher ;</w:t>
       </w:r>
     </w:p>
     <w:p>
@@ -3869,7 +3869,7 @@
         <w:spacing w:after="60"/>
       </w:pPr>
       <w:r>
-        <w:t xml:space="preserve">riz : environ 140 000 t d'offre ;</w:t>
+        <w:t xml:space="preserve">riz : environ 140 000 t d'offre selon la presse, mais 410 000 t de paddy en 2024 selon le MINFI (sources incompatibles, vérification finale) ;</w:t>
       </w:r>
     </w:p>
     <w:p>
@@ -4089,7 +4089,7 @@
         <w:t xml:space="preserve">Indicateur :</w:t>
       </w:r>
       <w:r>
-        <w:t xml:space="preserve"> part de la production nationale dans la consommation de riz. Départ estimé environ 14 % (à vérifier) ; cible à 3 ans de 30 % (proposée, à calibrer).</w:t>
+        <w:t xml:space="preserve"> part de la production nationale dans la consommation de riz. Départ estimé environ 14 à 30 % selon les sources (à établir) ; cible à 3 ans de +15 points (proposée, à calibrer).</w:t>
       </w:r>
     </w:p>
     <w:p>
@@ -6069,7 +6069,7 @@
                 <w:sz w:val="16"/>
                 <w:szCs w:val="16"/>
               </w:rPr>
-              <w:t xml:space="preserve">Part locale du riz : ≈14 % (à vérifier) → 30 % (proposée)</w:t>
+              <w:t xml:space="preserve">Part locale du riz : 14 à 30 % selon les sources (à établir) → +15 points (proposée)</w:t>
             </w:r>
           </w:p>
         </w:tc>

</xml_diff>